<commit_message>
docs: align public package with corrected demographics
</commit_message>
<xml_diff>
--- a/text/manuscript/Main.docx
+++ b/text/manuscript/Main.docx
@@ -553,7 +553,7 @@
           <w:rFonts w:asciiTheme="minorBidi" w:hAnsiTheme="minorBidi" w:cstheme="minorBidi"/>
           <w:color w:val="000000" w:themeColor="text1"/>
         </w:rPr>
-        <w:t>In a within-subject, placebo-controlled fMRI study, 37 healthy volunteers (21 female) underwent two sessions: intravenous ketamine (0.4 mg/kg bolus over 10 minutes followed by 0.4 mg/kg/h continuous infusion) or saline placebo. Individually calibrated thermal pain stimuli were applied to the right leg during scanning. Dissociative states were measured repeatedly using the Clinician-Administered Dissociative States Scale. Whole-brain univariate and multivariate analyses, as well as network-based functional connectivity analyses, were performed.</w:t>
+        <w:t>In a placebo-controlled fMRI study, 43 healthy volunteers (25 female) were included, of whom 30 completed both intravenous ketamine (0.4 mg/kg bolus over 10 minutes followed by 0.4 mg/kg/h continuous infusion) and saline placebo sessions. Individually calibrated thermal pain stimuli were applied to the right leg during scanning. Dissociative states were measured repeatedly using the Clinician-Administered Dissociative States Scale. Whole-brain univariate and multivariate analyses, as well as network-based functional connectivity analyses, were performed.</w:t>
       </w:r>
     </w:p>
     <w:p>
@@ -586,7 +586,7 @@
           <w:rFonts w:asciiTheme="minorBidi" w:hAnsiTheme="minorBidi" w:cstheme="minorBidi"/>
           <w:color w:val="000000" w:themeColor="text1"/>
         </w:rPr>
-        <w:t xml:space="preserve">1,54) = 11.22, p &lt; .001) and dissociation (main effect of session: </w:t>
+        <w:t xml:space="preserve">1,54) = 11.22, p = .001) and dissociation (main effect of session: </w:t>
       </w:r>
       <w:proofErr w:type="gramStart"/>
       <w:r>
@@ -1541,7 +1541,7 @@
           <w:rFonts w:asciiTheme="minorBidi" w:hAnsiTheme="minorBidi" w:cstheme="minorBidi"/>
           <w:color w:val="000000" w:themeColor="text1"/>
         </w:rPr>
-        <w:t>. A total of thirty-seven healthy volunteers (mean age 29.7 ± 3.21 years, 21 females) were enrolled in the study</w:t>
+        <w:t>. A total of 43 healthy volunteers (mean age 29.8 ± 3.45 years, 25 females) were included in the study</w:t>
       </w:r>
       <w:r>
         <w:rPr>
@@ -1555,7 +1555,7 @@
           <w:rFonts w:asciiTheme="minorBidi" w:hAnsiTheme="minorBidi" w:cstheme="minorBidi"/>
           <w:color w:val="000000" w:themeColor="text1"/>
         </w:rPr>
-        <w:t>, with 33 completing the full procedure (mean age 30.1 ± 3.09 years, 18 females)</w:t>
+        <w:t>, with 30 completing the full procedure (mean age 30.0 ± 3.08 years, 16 females)</w:t>
       </w:r>
       <w:r>
         <w:rPr>
@@ -1586,7 +1586,7 @@
           <w:rFonts w:asciiTheme="minorBidi" w:hAnsiTheme="minorBidi" w:cstheme="minorBidi"/>
           <w:color w:val="000000" w:themeColor="text1"/>
         </w:rPr>
-        <w:t>. Each volunteer participated in two sessions: one involving the administration of a placebo (IV saline) and the other involving the administration of racemic ketamine (initial bolus of</w:t>
+        <w:t>. Each volunteer who completed the full procedure participated in two sessions: one involving the administration of a placebo (IV saline) and the other involving the administration of racemic ketamine (initial bolus of</w:t>
       </w:r>
       <w:r>
         <w:rPr>
@@ -2398,7 +2398,7 @@
           <w:highlight w:val="white"/>
           <w:lang w:val="en"/>
         </w:rPr>
-        <w:t>he interval between sessions averaged 24.0 ± 17.1 days</w:t>
+        <w:t>he interval between sessions averaged 24.5 ± 22.5 days among participants who completed both sessions</w:t>
       </w:r>
       <w:r>
         <w:rPr>
@@ -2429,7 +2429,7 @@
           <w:highlight w:val="white"/>
           <w:lang w:val="en"/>
         </w:rPr>
-        <w:t xml:space="preserve">Thirty-seven healthy volunteers were enrolled (mean age 29.7 ± 3.21 years; 21 females, 16 males), and 33 completed the full procedure (mean age 30.1 ± 3.09 years; 18 females, 15 males). All participants had a mean body weight of 61.6 ± 9.4 kg (range: 43–81 kg) and received weight-based dosing (0.4 mg/kg bolus, 0.4 mg/kg/h infusion). </w:t>
+        <w:t xml:space="preserve">Forty-three healthy volunteers were included in the analysis (mean age 29.8 ± 3.45 years; 25 females, 18 males), and 30 completed the full procedure (mean age 30.0 ± 3.08 years; 16 females, 14 males). Participants with available dosing data had a mean body weight of 61.6 ± 9.4 kg (range: 43–81 kg) and received weight-based dosing (0.4 mg/kg bolus, 0.4 mg/kg/h infusion). </w:t>
       </w:r>
     </w:p>
     <w:p>
@@ -3115,7 +3115,7 @@
           <w:color w:val="000000" w:themeColor="text1"/>
           <w:lang w:val="en"/>
         </w:rPr>
-        <w:t>1,54) = 11.22, p &lt; .001). Post-hoc tests showed that ketamine selectively reduced ratings for painful stimuli (</w:t>
+        <w:t>1,54) = 11.22, p = .001). Post-hoc tests showed that ketamine selectively reduced ratings for painful stimuli (</w:t>
       </w:r>
       <w:proofErr w:type="gramStart"/>
       <w:r>
@@ -3346,7 +3346,7 @@
           <w:color w:val="000000" w:themeColor="text1"/>
           <w:lang w:val="en"/>
         </w:rPr>
-        <w:t>2,477.73) = 109.51, p &lt; .001). Ketamine significantly increased scores across all dissociation subscales between the pre-infusion and post-bolus time points (all p &lt; .001), whereas no corresponding changes were observed in the placebo session (all p &gt; .9; Figure 2</w:t>
+        <w:t>2,477.73) = 109.51, p &lt; .001). Ketamine significantly increased scores across all dissociation subscales between the pre-infusion and post-bolus time points (all p &lt; .001), whereas no corresponding changes were observed in the placebo session (all p &gt; .79; Figure 2</w:t>
       </w:r>
       <w:r>
         <w:rPr>
@@ -7588,7 +7588,7 @@
           <w:color w:val="000000" w:themeColor="text1"/>
           <w:lang w:val="en"/>
         </w:rPr>
-        <w:t xml:space="preserve">E). Subscale analyses revealed significant associations with derealization (ρ = .58, p = .005) and amnesia (ρ = .37, p = .05), but not depersonalization (ρ = .24, p = .23). In contrast, changes in DMN connectivity were not associated with ketamine-related reductions in pain ratings (ρ = −.06, p = .78) or with pain ratings during the ketamine session (ρ = −.07, p = .72). </w:t>
+        <w:t xml:space="preserve">E). Subscale analyses revealed significant associations with derealization (ρ = .58, p = .001) and amnesia (ρ = .37, p = .05), but not depersonalization (ρ = .24, p = .23). In contrast, changes in DMN connectivity were not associated with ketamine-related reductions in pain ratings (ρ = −.06, p = .78) or with pain ratings during the ketamine session (ρ = −.07, p = .72). </w:t>
       </w:r>
       <w:r>
         <w:rPr>

</xml_diff>